<commit_message>
Creato QdC e aggiustamenti
</commit_message>
<xml_diff>
--- a/4_Diari/Modello Diario v1.docx
+++ b/4_Diari/Modello Diario v1.docx
@@ -110,44 +110,14 @@
                 <w:rFonts w:ascii="Arial" w:hAnsi="Arial" w:cs="Arial"/>
               </w:rPr>
             </w:pPr>
-            <w:proofErr w:type="spellStart"/>
-            <w:proofErr w:type="gramStart"/>
             <w:r>
               <w:rPr>
                 <w:rFonts w:ascii="Arial" w:hAnsi="Arial" w:cs="Arial"/>
               </w:rPr>
-              <w:t>gg</w:t>
+              <w:t>15.01.2025</w:t>
             </w:r>
-            <w:r>
-              <w:rPr>
-                <w:rFonts w:ascii="Arial" w:hAnsi="Arial" w:cs="Arial"/>
-              </w:rPr>
-              <w:t>.</w:t>
-            </w:r>
-            <w:r>
-              <w:rPr>
-                <w:rFonts w:ascii="Arial" w:hAnsi="Arial" w:cs="Arial"/>
-              </w:rPr>
-              <w:t>mm</w:t>
-            </w:r>
-            <w:r>
-              <w:rPr>
-                <w:rFonts w:ascii="Arial" w:hAnsi="Arial" w:cs="Arial"/>
-              </w:rPr>
-              <w:t>.</w:t>
-            </w:r>
-            <w:r>
-              <w:rPr>
-                <w:rFonts w:ascii="Arial" w:hAnsi="Arial" w:cs="Arial"/>
-              </w:rPr>
-              <w:t>aaaa</w:t>
-            </w:r>
-            <w:proofErr w:type="spellEnd"/>
-            <w:proofErr w:type="gramEnd"/>
           </w:p>
         </w:tc>
-        <w:bookmarkStart w:id="0" w:name="_GoBack"/>
-        <w:bookmarkEnd w:id="0"/>
       </w:tr>
     </w:tbl>
     <w:p>
@@ -178,9 +148,9 @@
                 <w:rFonts w:ascii="Arial" w:hAnsi="Arial" w:cs="Arial"/>
               </w:rPr>
             </w:pPr>
-            <w:bookmarkStart w:id="1" w:name="OLE_LINK10"/>
-            <w:bookmarkStart w:id="2" w:name="OLE_LINK11"/>
-            <w:bookmarkStart w:id="3" w:name="OLE_LINK12"/>
+            <w:bookmarkStart w:id="0" w:name="OLE_LINK10"/>
+            <w:bookmarkStart w:id="1" w:name="OLE_LINK11"/>
+            <w:bookmarkStart w:id="2" w:name="OLE_LINK12"/>
             <w:r>
               <w:rPr>
                 <w:rFonts w:ascii="Arial" w:hAnsi="Arial" w:cs="Arial"/>
@@ -197,16 +167,93 @@
           </w:tcPr>
           <w:p>
             <w:pPr>
+              <w:pStyle w:val="Paragrafoelenco"/>
+              <w:numPr>
+                <w:ilvl w:val="0"/>
+                <w:numId w:val="21"/>
+              </w:numPr>
               <w:rPr>
                 <w:rFonts w:ascii="Arial" w:hAnsi="Arial" w:cs="Arial"/>
               </w:rPr>
             </w:pPr>
+            <w:r>
+              <w:rPr>
+                <w:rFonts w:ascii="Arial" w:hAnsi="Arial" w:cs="Arial"/>
+              </w:rPr>
+              <w:t>Quaderno dei compiti</w:t>
+            </w:r>
+            <w:r>
+              <w:rPr>
+                <w:rFonts w:ascii="Arial" w:hAnsi="Arial" w:cs="Arial"/>
+              </w:rPr>
+              <w:t xml:space="preserve"> (da finire)</w:t>
+            </w:r>
+          </w:p>
+          <w:p>
+            <w:pPr>
+              <w:pStyle w:val="Paragrafoelenco"/>
+              <w:numPr>
+                <w:ilvl w:val="0"/>
+                <w:numId w:val="21"/>
+              </w:numPr>
+              <w:rPr>
+                <w:rFonts w:ascii="Arial" w:hAnsi="Arial" w:cs="Arial"/>
+              </w:rPr>
+            </w:pPr>
+            <w:r>
+              <w:rPr>
+                <w:rFonts w:ascii="Arial" w:hAnsi="Arial" w:cs="Arial"/>
+              </w:rPr>
+              <w:t>Iniziata la p</w:t>
+            </w:r>
+            <w:r>
+              <w:rPr>
+                <w:rFonts w:ascii="Arial" w:hAnsi="Arial" w:cs="Arial"/>
+              </w:rPr>
+              <w:t>rogettazione</w:t>
+            </w:r>
+            <w:r>
+              <w:rPr>
+                <w:rFonts w:ascii="Arial" w:hAnsi="Arial" w:cs="Arial"/>
+              </w:rPr>
+              <w:t xml:space="preserve"> della GUI</w:t>
+            </w:r>
+          </w:p>
+          <w:p>
+            <w:pPr>
+              <w:pStyle w:val="Paragrafoelenco"/>
+              <w:numPr>
+                <w:ilvl w:val="0"/>
+                <w:numId w:val="21"/>
+              </w:numPr>
+              <w:rPr>
+                <w:rFonts w:ascii="Arial" w:hAnsi="Arial" w:cs="Arial"/>
+              </w:rPr>
+            </w:pPr>
+            <w:r>
+              <w:rPr>
+                <w:rFonts w:ascii="Arial" w:hAnsi="Arial" w:cs="Arial"/>
+              </w:rPr>
+              <w:t>Iniziata la p</w:t>
+            </w:r>
+            <w:r>
+              <w:rPr>
+                <w:rFonts w:ascii="Arial" w:hAnsi="Arial" w:cs="Arial"/>
+              </w:rPr>
+              <w:t>rogettazione</w:t>
+            </w:r>
+            <w:r>
+              <w:rPr>
+                <w:rFonts w:ascii="Arial" w:hAnsi="Arial" w:cs="Arial"/>
+              </w:rPr>
+              <w:t xml:space="preserve"> dello use case</w:t>
+            </w:r>
           </w:p>
         </w:tc>
       </w:tr>
+      <w:bookmarkEnd w:id="0"/>
       <w:bookmarkEnd w:id="1"/>
       <w:bookmarkEnd w:id="2"/>
-      <w:bookmarkEnd w:id="3"/>
     </w:tbl>
     <w:p>
       <w:pPr>
@@ -256,6 +303,12 @@
                 <w:rFonts w:ascii="Arial" w:hAnsi="Arial" w:cs="Arial"/>
               </w:rPr>
             </w:pPr>
+            <w:r>
+              <w:rPr>
+                <w:rFonts w:ascii="Arial" w:hAnsi="Arial" w:cs="Arial"/>
+              </w:rPr>
+              <w:t>-</w:t>
+            </w:r>
           </w:p>
         </w:tc>
       </w:tr>
@@ -308,6 +361,12 @@
                 <w:rFonts w:ascii="Arial" w:hAnsi="Arial" w:cs="Arial"/>
               </w:rPr>
             </w:pPr>
+            <w:r>
+              <w:rPr>
+                <w:rFonts w:ascii="Arial" w:hAnsi="Arial" w:cs="Arial"/>
+              </w:rPr>
+              <w:t>-</w:t>
+            </w:r>
           </w:p>
         </w:tc>
       </w:tr>
@@ -360,6 +419,76 @@
                 <w:rFonts w:ascii="Arial" w:hAnsi="Arial" w:cs="Arial"/>
               </w:rPr>
             </w:pPr>
+            <w:r>
+              <w:rPr>
+                <w:rFonts w:ascii="Arial" w:hAnsi="Arial" w:cs="Arial"/>
+              </w:rPr>
+              <w:t xml:space="preserve">Concludere il </w:t>
+            </w:r>
+            <w:proofErr w:type="spellStart"/>
+            <w:r>
+              <w:rPr>
+                <w:rFonts w:ascii="Arial" w:hAnsi="Arial" w:cs="Arial"/>
+              </w:rPr>
+              <w:t>QdC</w:t>
+            </w:r>
+            <w:proofErr w:type="spellEnd"/>
+            <w:r>
+              <w:rPr>
+                <w:rFonts w:ascii="Arial" w:hAnsi="Arial" w:cs="Arial"/>
+              </w:rPr>
+              <w:t xml:space="preserve">, </w:t>
+            </w:r>
+            <w:r>
+              <w:rPr>
+                <w:rFonts w:ascii="Arial" w:hAnsi="Arial" w:cs="Arial"/>
+              </w:rPr>
+              <w:t xml:space="preserve">cominciare il </w:t>
+            </w:r>
+            <w:bookmarkStart w:id="3" w:name="_GoBack"/>
+            <w:bookmarkEnd w:id="3"/>
+            <w:r>
+              <w:rPr>
+                <w:rFonts w:ascii="Arial" w:hAnsi="Arial" w:cs="Arial"/>
+              </w:rPr>
+              <w:t>Gantt</w:t>
+            </w:r>
+            <w:r>
+              <w:rPr>
+                <w:rFonts w:ascii="Arial" w:hAnsi="Arial" w:cs="Arial"/>
+              </w:rPr>
+              <w:t xml:space="preserve">, </w:t>
+            </w:r>
+            <w:r>
+              <w:rPr>
+                <w:rFonts w:ascii="Arial" w:hAnsi="Arial" w:cs="Arial"/>
+              </w:rPr>
+              <w:t xml:space="preserve">cominciare </w:t>
+            </w:r>
+            <w:r>
+              <w:rPr>
+                <w:rFonts w:ascii="Arial" w:hAnsi="Arial" w:cs="Arial"/>
+              </w:rPr>
+              <w:t>documentazione</w:t>
+            </w:r>
+            <w:r>
+              <w:rPr>
+                <w:rFonts w:ascii="Arial" w:hAnsi="Arial" w:cs="Arial"/>
+              </w:rPr>
+              <w:t>, finire use case</w:t>
+            </w:r>
+            <w:r>
+              <w:rPr>
+                <w:rFonts w:ascii="Arial" w:hAnsi="Arial" w:cs="Arial"/>
+              </w:rPr>
+              <w:t>, continuare la GUI</w:t>
+            </w:r>
+            <w:r>
+              <w:rPr>
+                <w:rFonts w:ascii="Arial" w:hAnsi="Arial" w:cs="Arial"/>
+              </w:rPr>
+              <w:t xml:space="preserve"> </w:t>
+            </w:r>
           </w:p>
         </w:tc>
       </w:tr>
@@ -572,26 +701,38 @@
     <w:pPr>
       <w:rPr>
         <w:rFonts w:ascii="Arial" w:hAnsi="Arial" w:cs="Arial"/>
-        <w:shd w:val="clear" w:color="auto" w:fill="000000" w:themeFill="text1"/>
       </w:rPr>
     </w:pPr>
     <w:r>
       <w:rPr>
         <w:rFonts w:ascii="Arial" w:hAnsi="Arial" w:cs="Arial"/>
       </w:rPr>
-      <w:t>Nome C</w:t>
+      <w:t>Samuele, Christian, Andrea, Andrea</w:t>
     </w:r>
     <w:r>
       <w:rPr>
         <w:rFonts w:ascii="Arial" w:hAnsi="Arial" w:cs="Arial"/>
       </w:rPr>
-      <w:t>ognome</w:t>
+      <w:tab/>
     </w:r>
     <w:r>
       <w:rPr>
         <w:rFonts w:ascii="Arial" w:hAnsi="Arial" w:cs="Arial"/>
       </w:rPr>
-      <w:t xml:space="preserve"> Classe</w:t>
+      <w:tab/>
+    </w:r>
+    <w:r>
+      <w:rPr>
+        <w:rFonts w:ascii="Arial" w:hAnsi="Arial" w:cs="Arial"/>
+      </w:rPr>
+      <w:tab/>
+      <w:t>I3B</w:t>
+    </w:r>
+    <w:r>
+      <w:rPr>
+        <w:rFonts w:ascii="Arial" w:hAnsi="Arial" w:cs="Arial"/>
+      </w:rPr>
+      <w:t>B/BC</w:t>
     </w:r>
   </w:p>
 </w:hdr>
@@ -825,6 +966,92 @@
     </w:lvl>
   </w:abstractNum>
   <w:abstractNum w:abstractNumId="2" w15:restartNumberingAfterBreak="0">
+    <w:nsid w:val="1FE82E06"/>
+    <w:multiLevelType w:val="hybridMultilevel"/>
+    <w:tmpl w:val="9EC6B148"/>
+    <w:lvl w:ilvl="0" w:tplc="0810000F">
+      <w:start w:val="1"/>
+      <w:numFmt w:val="decimal"/>
+      <w:lvlText w:val="%1."/>
+      <w:lvlJc w:val="left"/>
+      <w:pPr>
+        <w:ind w:left="720" w:hanging="360"/>
+      </w:pPr>
+    </w:lvl>
+    <w:lvl w:ilvl="1" w:tplc="08100019" w:tentative="1">
+      <w:start w:val="1"/>
+      <w:numFmt w:val="lowerLetter"/>
+      <w:lvlText w:val="%2."/>
+      <w:lvlJc w:val="left"/>
+      <w:pPr>
+        <w:ind w:left="1440" w:hanging="360"/>
+      </w:pPr>
+    </w:lvl>
+    <w:lvl w:ilvl="2" w:tplc="0810001B" w:tentative="1">
+      <w:start w:val="1"/>
+      <w:numFmt w:val="lowerRoman"/>
+      <w:lvlText w:val="%3."/>
+      <w:lvlJc w:val="right"/>
+      <w:pPr>
+        <w:ind w:left="2160" w:hanging="180"/>
+      </w:pPr>
+    </w:lvl>
+    <w:lvl w:ilvl="3" w:tplc="0810000F" w:tentative="1">
+      <w:start w:val="1"/>
+      <w:numFmt w:val="decimal"/>
+      <w:lvlText w:val="%4."/>
+      <w:lvlJc w:val="left"/>
+      <w:pPr>
+        <w:ind w:left="2880" w:hanging="360"/>
+      </w:pPr>
+    </w:lvl>
+    <w:lvl w:ilvl="4" w:tplc="08100019" w:tentative="1">
+      <w:start w:val="1"/>
+      <w:numFmt w:val="lowerLetter"/>
+      <w:lvlText w:val="%5."/>
+      <w:lvlJc w:val="left"/>
+      <w:pPr>
+        <w:ind w:left="3600" w:hanging="360"/>
+      </w:pPr>
+    </w:lvl>
+    <w:lvl w:ilvl="5" w:tplc="0810001B" w:tentative="1">
+      <w:start w:val="1"/>
+      <w:numFmt w:val="lowerRoman"/>
+      <w:lvlText w:val="%6."/>
+      <w:lvlJc w:val="right"/>
+      <w:pPr>
+        <w:ind w:left="4320" w:hanging="180"/>
+      </w:pPr>
+    </w:lvl>
+    <w:lvl w:ilvl="6" w:tplc="0810000F" w:tentative="1">
+      <w:start w:val="1"/>
+      <w:numFmt w:val="decimal"/>
+      <w:lvlText w:val="%7."/>
+      <w:lvlJc w:val="left"/>
+      <w:pPr>
+        <w:ind w:left="5040" w:hanging="360"/>
+      </w:pPr>
+    </w:lvl>
+    <w:lvl w:ilvl="7" w:tplc="08100019" w:tentative="1">
+      <w:start w:val="1"/>
+      <w:numFmt w:val="lowerLetter"/>
+      <w:lvlText w:val="%8."/>
+      <w:lvlJc w:val="left"/>
+      <w:pPr>
+        <w:ind w:left="5760" w:hanging="360"/>
+      </w:pPr>
+    </w:lvl>
+    <w:lvl w:ilvl="8" w:tplc="0810001B" w:tentative="1">
+      <w:start w:val="1"/>
+      <w:numFmt w:val="lowerRoman"/>
+      <w:lvlText w:val="%9."/>
+      <w:lvlJc w:val="right"/>
+      <w:pPr>
+        <w:ind w:left="6480" w:hanging="180"/>
+      </w:pPr>
+    </w:lvl>
+  </w:abstractNum>
+  <w:abstractNum w:abstractNumId="3" w15:restartNumberingAfterBreak="0">
     <w:nsid w:val="36E11DF4"/>
     <w:multiLevelType w:val="hybridMultilevel"/>
     <w:tmpl w:val="1856E4BE"/>
@@ -936,7 +1163,7 @@
       </w:rPr>
     </w:lvl>
   </w:abstractNum>
-  <w:abstractNum w:abstractNumId="3" w15:restartNumberingAfterBreak="0">
+  <w:abstractNum w:abstractNumId="4" w15:restartNumberingAfterBreak="0">
     <w:nsid w:val="3AFA4BF8"/>
     <w:multiLevelType w:val="hybridMultilevel"/>
     <w:tmpl w:val="EF1C99B4"/>
@@ -1048,7 +1275,7 @@
       </w:rPr>
     </w:lvl>
   </w:abstractNum>
-  <w:abstractNum w:abstractNumId="4" w15:restartNumberingAfterBreak="0">
+  <w:abstractNum w:abstractNumId="5" w15:restartNumberingAfterBreak="0">
     <w:nsid w:val="3D4C551D"/>
     <w:multiLevelType w:val="hybridMultilevel"/>
     <w:tmpl w:val="1D629A34"/>
@@ -1161,7 +1388,7 @@
       </w:rPr>
     </w:lvl>
   </w:abstractNum>
-  <w:abstractNum w:abstractNumId="5" w15:restartNumberingAfterBreak="0">
+  <w:abstractNum w:abstractNumId="6" w15:restartNumberingAfterBreak="0">
     <w:nsid w:val="3EBE4D1A"/>
     <w:multiLevelType w:val="hybridMultilevel"/>
     <w:tmpl w:val="C2E8BF98"/>
@@ -1273,7 +1500,7 @@
       </w:rPr>
     </w:lvl>
   </w:abstractNum>
-  <w:abstractNum w:abstractNumId="6" w15:restartNumberingAfterBreak="0">
+  <w:abstractNum w:abstractNumId="7" w15:restartNumberingAfterBreak="0">
     <w:nsid w:val="3F671B2A"/>
     <w:multiLevelType w:val="hybridMultilevel"/>
     <w:tmpl w:val="837CCA7E"/>
@@ -1386,7 +1613,7 @@
       </w:rPr>
     </w:lvl>
   </w:abstractNum>
-  <w:abstractNum w:abstractNumId="7" w15:restartNumberingAfterBreak="0">
+  <w:abstractNum w:abstractNumId="8" w15:restartNumberingAfterBreak="0">
     <w:nsid w:val="432D4A14"/>
     <w:multiLevelType w:val="hybridMultilevel"/>
     <w:tmpl w:val="3850D6E2"/>
@@ -1498,7 +1725,7 @@
       </w:rPr>
     </w:lvl>
   </w:abstractNum>
-  <w:abstractNum w:abstractNumId="8" w15:restartNumberingAfterBreak="0">
+  <w:abstractNum w:abstractNumId="9" w15:restartNumberingAfterBreak="0">
     <w:nsid w:val="442C21C6"/>
     <w:multiLevelType w:val="hybridMultilevel"/>
     <w:tmpl w:val="D64E2F34"/>
@@ -1611,7 +1838,7 @@
       </w:rPr>
     </w:lvl>
   </w:abstractNum>
-  <w:abstractNum w:abstractNumId="9" w15:restartNumberingAfterBreak="0">
+  <w:abstractNum w:abstractNumId="10" w15:restartNumberingAfterBreak="0">
     <w:nsid w:val="44F65ACA"/>
     <w:multiLevelType w:val="hybridMultilevel"/>
     <w:tmpl w:val="A3C8D654"/>
@@ -1724,7 +1951,7 @@
       </w:rPr>
     </w:lvl>
   </w:abstractNum>
-  <w:abstractNum w:abstractNumId="10" w15:restartNumberingAfterBreak="0">
+  <w:abstractNum w:abstractNumId="11" w15:restartNumberingAfterBreak="0">
     <w:nsid w:val="45714A95"/>
     <w:multiLevelType w:val="hybridMultilevel"/>
     <w:tmpl w:val="05F4A790"/>
@@ -1836,7 +2063,7 @@
       </w:rPr>
     </w:lvl>
   </w:abstractNum>
-  <w:abstractNum w:abstractNumId="11" w15:restartNumberingAfterBreak="0">
+  <w:abstractNum w:abstractNumId="12" w15:restartNumberingAfterBreak="0">
     <w:nsid w:val="47473CE2"/>
     <w:multiLevelType w:val="hybridMultilevel"/>
     <w:tmpl w:val="ECF27DAE"/>
@@ -1948,7 +2175,7 @@
       </w:rPr>
     </w:lvl>
   </w:abstractNum>
-  <w:abstractNum w:abstractNumId="12" w15:restartNumberingAfterBreak="0">
+  <w:abstractNum w:abstractNumId="13" w15:restartNumberingAfterBreak="0">
     <w:nsid w:val="4D8115E5"/>
     <w:multiLevelType w:val="hybridMultilevel"/>
     <w:tmpl w:val="3DC066B4"/>
@@ -2061,7 +2288,7 @@
       </w:rPr>
     </w:lvl>
   </w:abstractNum>
-  <w:abstractNum w:abstractNumId="13" w15:restartNumberingAfterBreak="0">
+  <w:abstractNum w:abstractNumId="14" w15:restartNumberingAfterBreak="0">
     <w:nsid w:val="5A3606D5"/>
     <w:multiLevelType w:val="hybridMultilevel"/>
     <w:tmpl w:val="91805626"/>
@@ -2174,7 +2401,7 @@
       </w:rPr>
     </w:lvl>
   </w:abstractNum>
-  <w:abstractNum w:abstractNumId="14" w15:restartNumberingAfterBreak="0">
+  <w:abstractNum w:abstractNumId="15" w15:restartNumberingAfterBreak="0">
     <w:nsid w:val="61C87B25"/>
     <w:multiLevelType w:val="hybridMultilevel"/>
     <w:tmpl w:val="6FA21976"/>
@@ -2287,7 +2514,7 @@
       </w:rPr>
     </w:lvl>
   </w:abstractNum>
-  <w:abstractNum w:abstractNumId="15" w15:restartNumberingAfterBreak="0">
+  <w:abstractNum w:abstractNumId="16" w15:restartNumberingAfterBreak="0">
     <w:nsid w:val="621D43F7"/>
     <w:multiLevelType w:val="hybridMultilevel"/>
     <w:tmpl w:val="E1BA4850"/>
@@ -2400,7 +2627,7 @@
       </w:rPr>
     </w:lvl>
   </w:abstractNum>
-  <w:abstractNum w:abstractNumId="16" w15:restartNumberingAfterBreak="0">
+  <w:abstractNum w:abstractNumId="17" w15:restartNumberingAfterBreak="0">
     <w:nsid w:val="657763C8"/>
     <w:multiLevelType w:val="hybridMultilevel"/>
     <w:tmpl w:val="94F87C5A"/>
@@ -2513,7 +2740,7 @@
       </w:rPr>
     </w:lvl>
   </w:abstractNum>
-  <w:abstractNum w:abstractNumId="17" w15:restartNumberingAfterBreak="0">
+  <w:abstractNum w:abstractNumId="18" w15:restartNumberingAfterBreak="0">
     <w:nsid w:val="6AFC21B1"/>
     <w:multiLevelType w:val="hybridMultilevel"/>
     <w:tmpl w:val="ABCC59D8"/>
@@ -2625,7 +2852,7 @@
       </w:rPr>
     </w:lvl>
   </w:abstractNum>
-  <w:abstractNum w:abstractNumId="18" w15:restartNumberingAfterBreak="0">
+  <w:abstractNum w:abstractNumId="19" w15:restartNumberingAfterBreak="0">
     <w:nsid w:val="74DB59D8"/>
     <w:multiLevelType w:val="hybridMultilevel"/>
     <w:tmpl w:val="E334E25C"/>
@@ -2738,7 +2965,7 @@
       </w:rPr>
     </w:lvl>
   </w:abstractNum>
-  <w:abstractNum w:abstractNumId="19" w15:restartNumberingAfterBreak="0">
+  <w:abstractNum w:abstractNumId="20" w15:restartNumberingAfterBreak="0">
     <w:nsid w:val="7DC25969"/>
     <w:multiLevelType w:val="hybridMultilevel"/>
     <w:tmpl w:val="49A4B118"/>
@@ -2828,63 +3055,66 @@
     </w:lvl>
   </w:abstractNum>
   <w:num w:numId="1">
-    <w:abstractNumId w:val="14"/>
+    <w:abstractNumId w:val="15"/>
   </w:num>
   <w:num w:numId="2">
-    <w:abstractNumId w:val="12"/>
+    <w:abstractNumId w:val="13"/>
   </w:num>
   <w:num w:numId="3">
-    <w:abstractNumId w:val="15"/>
+    <w:abstractNumId w:val="16"/>
   </w:num>
   <w:num w:numId="4">
-    <w:abstractNumId w:val="4"/>
+    <w:abstractNumId w:val="5"/>
   </w:num>
   <w:num w:numId="5">
-    <w:abstractNumId w:val="18"/>
+    <w:abstractNumId w:val="19"/>
   </w:num>
   <w:num w:numId="6">
     <w:abstractNumId w:val="1"/>
   </w:num>
   <w:num w:numId="7">
-    <w:abstractNumId w:val="16"/>
+    <w:abstractNumId w:val="17"/>
   </w:num>
   <w:num w:numId="8">
+    <w:abstractNumId w:val="9"/>
+  </w:num>
+  <w:num w:numId="9">
+    <w:abstractNumId w:val="6"/>
+  </w:num>
+  <w:num w:numId="10">
     <w:abstractNumId w:val="8"/>
   </w:num>
-  <w:num w:numId="9">
-    <w:abstractNumId w:val="5"/>
-  </w:num>
-  <w:num w:numId="10">
-    <w:abstractNumId w:val="7"/>
-  </w:num>
   <w:num w:numId="11">
-    <w:abstractNumId w:val="13"/>
+    <w:abstractNumId w:val="14"/>
   </w:num>
   <w:num w:numId="12">
     <w:abstractNumId w:val="0"/>
   </w:num>
   <w:num w:numId="13">
+    <w:abstractNumId w:val="4"/>
+  </w:num>
+  <w:num w:numId="14">
+    <w:abstractNumId w:val="11"/>
+  </w:num>
+  <w:num w:numId="15">
+    <w:abstractNumId w:val="7"/>
+  </w:num>
+  <w:num w:numId="16">
+    <w:abstractNumId w:val="12"/>
+  </w:num>
+  <w:num w:numId="17">
+    <w:abstractNumId w:val="20"/>
+  </w:num>
+  <w:num w:numId="18">
+    <w:abstractNumId w:val="10"/>
+  </w:num>
+  <w:num w:numId="19">
+    <w:abstractNumId w:val="18"/>
+  </w:num>
+  <w:num w:numId="20">
     <w:abstractNumId w:val="3"/>
   </w:num>
-  <w:num w:numId="14">
-    <w:abstractNumId w:val="10"/>
-  </w:num>
-  <w:num w:numId="15">
-    <w:abstractNumId w:val="6"/>
-  </w:num>
-  <w:num w:numId="16">
-    <w:abstractNumId w:val="11"/>
-  </w:num>
-  <w:num w:numId="17">
-    <w:abstractNumId w:val="19"/>
-  </w:num>
-  <w:num w:numId="18">
-    <w:abstractNumId w:val="9"/>
-  </w:num>
-  <w:num w:numId="19">
-    <w:abstractNumId w:val="17"/>
-  </w:num>
-  <w:num w:numId="20">
+  <w:num w:numId="21">
     <w:abstractNumId w:val="2"/>
   </w:num>
 </w:numbering>
@@ -3946,6 +4176,7 @@
     <w:rsid w:val="00B36B9F"/>
     <w:rsid w:val="00B5079C"/>
     <w:rsid w:val="00BD119E"/>
+    <w:rsid w:val="00C15546"/>
     <w:rsid w:val="00C22A10"/>
     <w:rsid w:val="00C57AC2"/>
     <w:rsid w:val="00CB349C"/>
@@ -3965,6 +4196,7 @@
     <w:rsid w:val="00E13AFB"/>
     <w:rsid w:val="00E26C6E"/>
     <w:rsid w:val="00E316BF"/>
+    <w:rsid w:val="00E31D66"/>
     <w:rsid w:val="00E42975"/>
     <w:rsid w:val="00E65056"/>
     <w:rsid w:val="00EA31B1"/>
@@ -4771,7 +5003,7 @@
 </file>
 
 <file path=customXml/itemProps1.xml><?xml version="1.0" encoding="utf-8"?>
-<ds:datastoreItem xmlns:ds="http://schemas.openxmlformats.org/officeDocument/2006/customXml" ds:itemID="{A4D352A7-3801-4E51-8ED0-E5F8E4A7EC31}">
+<ds:datastoreItem xmlns:ds="http://schemas.openxmlformats.org/officeDocument/2006/customXml" ds:itemID="{98AE0FCF-BDE3-47F6-B0FA-C552CCE9F00B}">
   <ds:schemaRefs>
     <ds:schemaRef ds:uri="http://schemas.openxmlformats.org/officeDocument/2006/bibliography"/>
   </ds:schemaRefs>

</xml_diff>